<commit_message>
Seguimos con TPI Simulacion
</commit_message>
<xml_diff>
--- a/Simulacion/TPI/Estimación.docx
+++ b/Simulacion/TPI/Estimación.docx
@@ -240,15 +240,7 @@
       </w:r>
       <w:r>
         <w:br/>
-      </w:r>
-      <w:r>
-        <w:t>En presencia de semáforos, las llegadas a la rotonda suelen modelarse como Poisson no estacionario (NHPP) con tasa λ(t) que varía por hora (picos AM/PM).</w:t>
-      </w:r>
-      <w:r>
-        <w:t xml:space="preserve"> </w:t>
-      </w:r>
-      <w:r>
-        <w:t xml:space="preserve">En intervalos cortos con λ(t) casi constante, el conteo de llegadas es bien aproximado por un Poisson de parámetro </w:t>
+        <w:t xml:space="preserve">En presencia de semáforos, las llegadas a la rotonda suelen modelarse como Poisson no estacionario (NHPP) con tasa λ(t) que varía por hora (picos AM/PM). En intervalos cortos con λ(t) casi constante, el conteo de llegadas es bien aproximado por un Poisson de parámetro </w:t>
       </w:r>
       <w:proofErr w:type="spellStart"/>
       <w:r>
@@ -256,19 +248,7 @@
       </w:r>
       <w:proofErr w:type="spellEnd"/>
       <w:r>
-        <w:t>.</w:t>
-      </w:r>
-      <w:r>
-        <w:t xml:space="preserve"> </w:t>
-      </w:r>
-      <w:r>
-        <w:t>Además, la superposición de múltiples corrientes con desincronizaciones de fase y variabilidad de ciclos tiende a acercar el proceso resultante a Poisson (teorema de superposición para procesos de renovación).</w:t>
-      </w:r>
-      <w:r>
-        <w:t xml:space="preserve"> </w:t>
-      </w:r>
-      <w:r>
-        <w:t xml:space="preserve">Por eso, en la práctica de simulación de tráfico urbano con intersecciones semaforizadas, es estándar fijar Poisson con λ por </w:t>
+        <w:t xml:space="preserve">. Además, la superposición de múltiples corrientes con desincronizaciones de fase y variabilidad de ciclos tiende a acercar el proceso resultante a Poisson (teorema de superposición para procesos de renovación). Por eso, en la práctica de simulación de tráfico urbano con intersecciones semaforizadas, es estándar fijar Poisson con λ por </w:t>
       </w:r>
       <w:proofErr w:type="spellStart"/>
       <w:r>
@@ -276,10 +256,7 @@
       </w:r>
       <w:proofErr w:type="spellEnd"/>
       <w:r>
-        <w:t xml:space="preserve"> y franja horaria</w:t>
-      </w:r>
-      <w:r>
-        <w:t>.</w:t>
+        <w:t xml:space="preserve"> y franja horaria.</w:t>
       </w:r>
       <w:r>
         <w:br/>
@@ -589,25 +566,7 @@
                 <w:rPr>
                   <w:rFonts w:ascii="Cambria Math" w:hAnsi="Cambria Math"/>
                 </w:rPr>
-                <m:t>3</m:t>
-              </m:r>
-              <m:r>
-                <w:rPr>
-                  <w:rFonts w:ascii="Cambria Math" w:hAnsi="Cambria Math"/>
-                </w:rPr>
-                <m:t>6</m:t>
-              </m:r>
-              <m:r>
-                <w:rPr>
-                  <w:rFonts w:ascii="Cambria Math" w:hAnsi="Cambria Math"/>
-                </w:rPr>
-                <m:t>0</m:t>
-              </m:r>
-              <m:r>
-                <w:rPr>
-                  <w:rFonts w:ascii="Cambria Math" w:hAnsi="Cambria Math"/>
-                </w:rPr>
-                <m:t>0</m:t>
+                <m:t>3600</m:t>
               </m:r>
             </m:den>
           </m:f>
@@ -700,13 +659,7 @@
         <w:pStyle w:val="Prrafodelista"/>
       </w:pPr>
       <w:r>
-        <w:t>Ahora que se tienen las tasas de llegada (</w:t>
-      </w:r>
-      <w:r>
-        <w:t>λ</w:t>
-      </w:r>
-      <w:r>
-        <w:t>) para cada avenida, se puede usar la Ley de Little para estimar el tiempo promedio de permanencia (W) en la rotonda (servidor).</w:t>
+        <w:t>Ahora que se tienen las tasas de llegada (λ) para cada avenida, se puede usar la Ley de Little para estimar el tiempo promedio de permanencia (W) en la rotonda (servidor).</w:t>
       </w:r>
     </w:p>
     <w:p>
@@ -833,13 +786,7 @@
             <w:rPr>
               <w:rFonts w:ascii="Cambria Math" w:hAnsi="Cambria Math"/>
             </w:rPr>
-            <m:t>W</m:t>
-          </m:r>
-          <m:r>
-            <w:rPr>
-              <w:rFonts w:ascii="Cambria Math" w:hAnsi="Cambria Math"/>
-            </w:rPr>
-            <m:t>=</m:t>
+            <m:t>W=</m:t>
           </m:r>
           <m:f>
             <m:fPr>
@@ -1229,14 +1176,7 @@
           <w:rFonts w:eastAsiaTheme="minorEastAsia"/>
           <w:vertAlign w:val="subscript"/>
         </w:rPr>
-        <w:t>i</w:t>
-      </w:r>
-      <w:r>
-        <w:rPr>
-          <w:rFonts w:eastAsiaTheme="minorEastAsia"/>
-          <w:vertAlign w:val="subscript"/>
-        </w:rPr>
-        <w:t>j</w:t>
+        <w:t>ij</w:t>
       </w:r>
       <w:proofErr w:type="spellEnd"/>
       <w:r>
@@ -1422,10 +1362,7 @@
       </w:r>
       <w:proofErr w:type="spellEnd"/>
       <w:r>
-        <w:t>​ = número de autos que entraron por la avenida i y salieron por la avenida j</w:t>
-      </w:r>
-      <w:r>
-        <w:t>.</w:t>
+        <w:t>​ = número de autos que entraron por la avenida i y salieron por la avenida j.</w:t>
       </w:r>
     </w:p>
     <w:p>
@@ -1662,13 +1599,7 @@
             <w:rPr>
               <w:rFonts w:ascii="Cambria Math" w:hAnsi="Cambria Math"/>
             </w:rPr>
-            <m:t>∝</m:t>
-          </m:r>
-          <m:r>
-            <w:rPr>
-              <w:rFonts w:ascii="Cambria Math" w:hAnsi="Cambria Math"/>
-            </w:rPr>
-            <m:t xml:space="preserve"> </m:t>
+            <m:t xml:space="preserve">∝ </m:t>
           </m:r>
           <m:f>
             <m:fPr>
@@ -1906,7 +1837,7 @@
     </w:p>
     <w:p>
       <w:pPr>
-        <w:ind w:left="1416"/>
+        <w:ind w:left="1788"/>
       </w:pPr>
       <w:r>
         <w:t xml:space="preserve">Finalmente, se verifica que cada fila sume 1 y se guarda el resultado en un archivo exit_probability_matrix.csv, que puede luego usarse en </w:t>
@@ -1927,7 +1858,170 @@
     </w:p>
     <w:p>
       <w:pPr>
-        <w:pStyle w:val="Prrafodelista"/>
+        <w:ind w:left="708"/>
+      </w:pPr>
+    </w:p>
+    <w:p>
+      <w:pPr>
+        <w:pStyle w:val="Prrafodelista"/>
+      </w:pPr>
+      <w:r>
+        <w:t>Probabilidades por salida:</w:t>
+      </w:r>
+    </w:p>
+    <w:p>
+      <w:pPr>
+        <w:pStyle w:val="Prrafodelista"/>
+      </w:pPr>
+      <w:r>
+        <w:t xml:space="preserve">Dividimos a 1 (suma de todas las probabilidades) por la cantidad de carriles posibles de salida (22), luego le otorgamos una probabilidad de </w:t>
+      </w:r>
+      <w:r>
+        <w:lastRenderedPageBreak/>
+        <w:t xml:space="preserve">salida a cada calle en función de la cantidad de carriles de </w:t>
+      </w:r>
+      <w:proofErr w:type="spellStart"/>
+      <w:r>
+        <w:t>saldia</w:t>
+      </w:r>
+      <w:proofErr w:type="spellEnd"/>
+      <w:r>
+        <w:t xml:space="preserve"> que tenga.</w:t>
+      </w:r>
+    </w:p>
+    <w:p>
+      <w:pPr>
+        <w:pStyle w:val="Prrafodelista"/>
+      </w:pPr>
+      <w:r>
+        <w:t>1/22 = 0.0454545454545454545</w:t>
+      </w:r>
+    </w:p>
+    <w:p>
+      <w:pPr>
+        <w:pStyle w:val="Prrafodelista"/>
+      </w:pPr>
+    </w:p>
+    <w:p>
+      <w:pPr>
+        <w:pStyle w:val="Prrafodelista"/>
+      </w:pPr>
+      <w:r>
+        <w:t>3*</w:t>
+      </w:r>
+      <w:proofErr w:type="spellStart"/>
+      <w:r>
+        <w:t>ans</w:t>
+      </w:r>
+      <w:proofErr w:type="spellEnd"/>
+      <w:r>
+        <w:t xml:space="preserve"> = 0.1364</w:t>
+      </w:r>
+    </w:p>
+    <w:p>
+      <w:pPr>
+        <w:pStyle w:val="Prrafodelista"/>
+      </w:pPr>
+      <w:r>
+        <w:t>2*</w:t>
+      </w:r>
+      <w:proofErr w:type="spellStart"/>
+      <w:r>
+        <w:t>ans</w:t>
+      </w:r>
+      <w:proofErr w:type="spellEnd"/>
+      <w:r>
+        <w:t xml:space="preserve"> = 0.0909</w:t>
+      </w:r>
+    </w:p>
+    <w:p>
+      <w:pPr>
+        <w:pStyle w:val="Prrafodelista"/>
+      </w:pPr>
+      <w:r>
+        <w:t>1*</w:t>
+      </w:r>
+      <w:proofErr w:type="spellStart"/>
+      <w:r>
+        <w:t>ans</w:t>
+      </w:r>
+      <w:proofErr w:type="spellEnd"/>
+      <w:r>
+        <w:t xml:space="preserve"> = 0.04545</w:t>
+      </w:r>
+    </w:p>
+    <w:p>
+      <w:pPr>
+        <w:pStyle w:val="Prrafodelista"/>
+      </w:pPr>
+    </w:p>
+    <w:p>
+      <w:pPr>
+        <w:pStyle w:val="Prrafodelista"/>
+      </w:pPr>
+      <w:r>
+        <w:t>2 * tres + 6 * dos + 4 * uno = 2 * 0.1364 + 6 * 0.0909 + 4 * 0.04545 = 1</w:t>
+      </w:r>
+    </w:p>
+    <w:p>
+      <w:pPr>
+        <w:pStyle w:val="Prrafodelista"/>
+      </w:pPr>
+    </w:p>
+    <w:p>
+      <w:pPr>
+        <w:pStyle w:val="Prrafodelista"/>
+      </w:pPr>
+    </w:p>
+    <w:p>
+      <w:pPr>
+        <w:pStyle w:val="Prrafodelista"/>
+      </w:pPr>
+    </w:p>
+    <w:p>
+      <w:pPr>
+        <w:pStyle w:val="Prrafodelista"/>
+      </w:pPr>
+    </w:p>
+    <w:p>
+      <w:pPr>
+        <w:pStyle w:val="Ttulo1"/>
+      </w:pPr>
+      <w:r>
+        <w:t>Hipótesis</w:t>
+      </w:r>
+    </w:p>
+    <w:p>
+      <w:pPr>
+        <w:pStyle w:val="Prrafodelista"/>
+        <w:numPr>
+          <w:ilvl w:val="0"/>
+          <w:numId w:val="7"/>
+        </w:numPr>
+      </w:pPr>
+      <w:r>
+        <w:t>Probar con prioridad de entrada a la rotonda y prioridad de salida de la rotonda.</w:t>
+      </w:r>
+    </w:p>
+    <w:p>
+      <w:pPr>
+        <w:pStyle w:val="Prrafodelista"/>
+        <w:numPr>
+          <w:ilvl w:val="0"/>
+          <w:numId w:val="7"/>
+        </w:numPr>
+      </w:pPr>
+      <w:r>
+        <w:t>Probar con semáforos más cerca de la rotonda y sin.</w:t>
+      </w:r>
+    </w:p>
+    <w:p>
+      <w:pPr>
+        <w:pStyle w:val="Prrafodelista"/>
+        <w:numPr>
+          <w:ilvl w:val="0"/>
+          <w:numId w:val="7"/>
+        </w:numPr>
       </w:pPr>
     </w:p>
     <w:sectPr>
@@ -2404,6 +2498,95 @@
     </w:lvl>
   </w:abstractNum>
   <w:abstractNum w:abstractNumId="4" w15:restartNumberingAfterBreak="0">
+    <w:nsid w:val="3CEB5251"/>
+    <w:multiLevelType w:val="hybridMultilevel"/>
+    <w:tmpl w:val="75F0F81E"/>
+    <w:lvl w:ilvl="0" w:tplc="249CE4EA">
+      <w:start w:val="1"/>
+      <w:numFmt w:val="decimal"/>
+      <w:lvlText w:val="%1-"/>
+      <w:lvlJc w:val="left"/>
+      <w:pPr>
+        <w:ind w:left="720" w:hanging="360"/>
+      </w:pPr>
+      <w:rPr>
+        <w:rFonts w:hint="default"/>
+      </w:rPr>
+    </w:lvl>
+    <w:lvl w:ilvl="1" w:tplc="2C0A0019" w:tentative="1">
+      <w:start w:val="1"/>
+      <w:numFmt w:val="lowerLetter"/>
+      <w:lvlText w:val="%2."/>
+      <w:lvlJc w:val="left"/>
+      <w:pPr>
+        <w:ind w:left="1440" w:hanging="360"/>
+      </w:pPr>
+    </w:lvl>
+    <w:lvl w:ilvl="2" w:tplc="2C0A001B" w:tentative="1">
+      <w:start w:val="1"/>
+      <w:numFmt w:val="lowerRoman"/>
+      <w:lvlText w:val="%3."/>
+      <w:lvlJc w:val="right"/>
+      <w:pPr>
+        <w:ind w:left="2160" w:hanging="180"/>
+      </w:pPr>
+    </w:lvl>
+    <w:lvl w:ilvl="3" w:tplc="2C0A000F" w:tentative="1">
+      <w:start w:val="1"/>
+      <w:numFmt w:val="decimal"/>
+      <w:lvlText w:val="%4."/>
+      <w:lvlJc w:val="left"/>
+      <w:pPr>
+        <w:ind w:left="2880" w:hanging="360"/>
+      </w:pPr>
+    </w:lvl>
+    <w:lvl w:ilvl="4" w:tplc="2C0A0019" w:tentative="1">
+      <w:start w:val="1"/>
+      <w:numFmt w:val="lowerLetter"/>
+      <w:lvlText w:val="%5."/>
+      <w:lvlJc w:val="left"/>
+      <w:pPr>
+        <w:ind w:left="3600" w:hanging="360"/>
+      </w:pPr>
+    </w:lvl>
+    <w:lvl w:ilvl="5" w:tplc="2C0A001B" w:tentative="1">
+      <w:start w:val="1"/>
+      <w:numFmt w:val="lowerRoman"/>
+      <w:lvlText w:val="%6."/>
+      <w:lvlJc w:val="right"/>
+      <w:pPr>
+        <w:ind w:left="4320" w:hanging="180"/>
+      </w:pPr>
+    </w:lvl>
+    <w:lvl w:ilvl="6" w:tplc="2C0A000F" w:tentative="1">
+      <w:start w:val="1"/>
+      <w:numFmt w:val="decimal"/>
+      <w:lvlText w:val="%7."/>
+      <w:lvlJc w:val="left"/>
+      <w:pPr>
+        <w:ind w:left="5040" w:hanging="360"/>
+      </w:pPr>
+    </w:lvl>
+    <w:lvl w:ilvl="7" w:tplc="2C0A0019" w:tentative="1">
+      <w:start w:val="1"/>
+      <w:numFmt w:val="lowerLetter"/>
+      <w:lvlText w:val="%8."/>
+      <w:lvlJc w:val="left"/>
+      <w:pPr>
+        <w:ind w:left="5760" w:hanging="360"/>
+      </w:pPr>
+    </w:lvl>
+    <w:lvl w:ilvl="8" w:tplc="2C0A001B" w:tentative="1">
+      <w:start w:val="1"/>
+      <w:numFmt w:val="lowerRoman"/>
+      <w:lvlText w:val="%9."/>
+      <w:lvlJc w:val="right"/>
+      <w:pPr>
+        <w:ind w:left="6480" w:hanging="180"/>
+      </w:pPr>
+    </w:lvl>
+  </w:abstractNum>
+  <w:abstractNum w:abstractNumId="5" w15:restartNumberingAfterBreak="0">
     <w:nsid w:val="3ED129BF"/>
     <w:multiLevelType w:val="hybridMultilevel"/>
     <w:tmpl w:val="885483A4"/>
@@ -2489,7 +2672,7 @@
       </w:pPr>
     </w:lvl>
   </w:abstractNum>
-  <w:abstractNum w:abstractNumId="5" w15:restartNumberingAfterBreak="0">
+  <w:abstractNum w:abstractNumId="6" w15:restartNumberingAfterBreak="0">
     <w:nsid w:val="69077049"/>
     <w:multiLevelType w:val="multilevel"/>
     <w:tmpl w:val="CF0A40D6"/>
@@ -2521,7 +2704,7 @@
         <w:rFonts w:hint="default"/>
       </w:rPr>
     </w:lvl>
-    <w:lvl w:ilvl="2" w:tentative="1">
+    <w:lvl w:ilvl="2">
       <w:start w:val="1"/>
       <w:numFmt w:val="bullet"/>
       <w:lvlText w:val=""/>
@@ -2641,16 +2824,19 @@
     <w:abstractNumId w:val="2"/>
   </w:num>
   <w:num w:numId="3" w16cid:durableId="576481565">
-    <w:abstractNumId w:val="4"/>
+    <w:abstractNumId w:val="5"/>
   </w:num>
   <w:num w:numId="4" w16cid:durableId="1992244532">
     <w:abstractNumId w:val="3"/>
   </w:num>
   <w:num w:numId="5" w16cid:durableId="964197351">
-    <w:abstractNumId w:val="5"/>
+    <w:abstractNumId w:val="6"/>
   </w:num>
   <w:num w:numId="6" w16cid:durableId="877282315">
     <w:abstractNumId w:val="1"/>
+  </w:num>
+  <w:num w:numId="7" w16cid:durableId="169754818">
+    <w:abstractNumId w:val="4"/>
   </w:num>
 </w:numbering>
 </file>
@@ -3266,6 +3452,7 @@
   <w:style w:type="character" w:default="1" w:styleId="Fuentedeprrafopredeter">
     <w:name w:val="Default Paragraph Font"/>
     <w:uiPriority w:val="1"/>
+    <w:semiHidden/>
     <w:unhideWhenUsed/>
   </w:style>
   <w:style w:type="table" w:default="1" w:styleId="Tablanormal">

</xml_diff>